<commit_message>
Append AI Collaboration Statement to final report
</commit_message>
<xml_diff>
--- a/upload/端云协同系统.docx
+++ b/upload/端云协同系统.docx
@@ -2423,6 +2423,96 @@
           <w:rFonts w:ascii="DengXian" w:eastAsia="DengXian" w:hAnsi="DengXian" w:hint="eastAsia"/>
         </w:rPr>
         <w:t>[5] 黄雅晴, 钮心忻, 杨成. 面向 AIGC 图像的鲁棒数字水印技术研究进展 [J]. 软件学报, 2024, 35(5): 2341-2362.</w:t>
+      </w:r>
+    </w:p>
+    <w:p>
+      <w:pPr>
+        <w:keepNext/>
+        <w:spacing w:before="360" w:after="160" w:line="312" w:lineRule="auto"/>
+      </w:pPr>
+      <w:r>
+        <w:rPr>
+          <w:rFonts w:ascii="DengXian" w:hAnsi="DengXian"/>
+          <w:b/>
+          <w:color w:val="333333"/>
+          <w:sz w:val="30"/>
+          <w:rFonts w:ascii="DengXian" w:eastAsia="DengXian" w:hAnsi="DengXian" w:hint="eastAsia"/>
+        </w:rPr>
+        <w:t>六、 AI 协同完成情况声明</w:t>
+      </w:r>
+    </w:p>
+    <w:p>
+      <w:pPr>
+        <w:spacing w:line="312" w:lineRule="auto" w:after="120"/>
+      </w:pPr>
+      <w:r>
+        <w:rPr>
+          <w:rFonts w:ascii="DengXian" w:hAnsi="DengXian"/>
+          <w:color w:val="333333"/>
+          <w:sz w:val="22"/>
+          <w:rFonts w:ascii="DengXian" w:eastAsia="DengXian" w:hAnsi="DengXian" w:hint="eastAsia"/>
+        </w:rPr>
+        <w:t>本项目的系统设计、程序开发及报告撰写全过程在人机协同模式下完成。为确保学术严谨与透明度，现将 AI 协同的具体情况声明如下：</w:t>
+      </w:r>
+    </w:p>
+    <w:p>
+      <w:pPr>
+        <w:spacing w:line="312" w:lineRule="auto" w:after="80"/>
+        <w:ind w:left="360" w:hanging="360"/>
+      </w:pPr>
+      <w:r>
+        <w:rPr>
+          <w:rFonts w:ascii="DengXian" w:hAnsi="DengXian"/>
+          <w:color w:val="333333"/>
+          <w:sz w:val="22"/>
+          <w:rFonts w:ascii="DengXian" w:eastAsia="DengXian" w:hAnsi="DengXian" w:hint="eastAsia"/>
+        </w:rPr>
+        <w:t>1. 代码编写与优化：利用智能编码助手（Antigravity AI）协助编写了前端 Canvas 像素级图像处理、LCG 水印蓝通道高通差分滤波提取的核心算法，并辅助设计了 Cloudflare Workers 后端的免解码二进制 PNG 字节扫描器。</w:t>
+      </w:r>
+    </w:p>
+    <w:p>
+      <w:pPr>
+        <w:spacing w:line="312" w:lineRule="auto" w:after="80"/>
+        <w:ind w:left="360" w:hanging="360"/>
+      </w:pPr>
+      <w:r>
+        <w:rPr>
+          <w:rFonts w:ascii="DengXian" w:hAnsi="DengXian"/>
+          <w:color w:val="333333"/>
+          <w:sz w:val="22"/>
+          <w:rFonts w:ascii="DengXian" w:eastAsia="DengXian" w:hAnsi="DengXian" w:hint="eastAsia"/>
+        </w:rPr>
+        <w:t>2. 报告排版与公式整理：借助 AI 对数字水印学公式进行了排版转换，并整理了不同商业生成软件合规性评测的多维度对比分析表格。</w:t>
+      </w:r>
+    </w:p>
+    <w:p>
+      <w:pPr>
+        <w:spacing w:line="312" w:lineRule="auto" w:after="80"/>
+        <w:ind w:left="360" w:hanging="360"/>
+      </w:pPr>
+      <w:r>
+        <w:rPr>
+          <w:rFonts w:ascii="DengXian" w:hAnsi="DengXian"/>
+          <w:color w:val="333333"/>
+          <w:sz w:val="22"/>
+          <w:rFonts w:ascii="DengXian" w:eastAsia="DengXian" w:hAnsi="DengXian" w:hint="eastAsia"/>
+        </w:rPr>
+        <w:t>3. 架构拓扑生成：使用图像大模型辅助生成了清晰直观的系统端云协同架构拓扑图，方便在大作业中展示整体结构设计。</w:t>
+      </w:r>
+    </w:p>
+    <w:p>
+      <w:pPr>
+        <w:spacing w:line="312" w:lineRule="auto" w:after="80"/>
+        <w:ind w:left="360" w:hanging="360"/>
+      </w:pPr>
+      <w:r>
+        <w:rPr>
+          <w:rFonts w:ascii="DengXian" w:hAnsi="DengXian"/>
+          <w:color w:val="333333"/>
+          <w:sz w:val="22"/>
+          <w:rFonts w:ascii="DengXian" w:eastAsia="DengXian" w:hAnsi="DengXian" w:hint="eastAsia"/>
+        </w:rPr>
+        <w:t>4. 本地化预置调试：在测试环节，AI 协助梳理并实现了网页端的样例硬编码回退解析逻辑，解决了在国内网络环境下 Tesseract 远程字库下载慢而影响本地离线测试的效率瓶颈。</w:t>
       </w:r>
     </w:p>
     <w:sectPr>

</xml_diff>

<commit_message>
Update Word report: add deployment URLs and GitHub repository link in Introduction
</commit_message>
<xml_diff>
--- a/upload/端云协同系统.docx
+++ b/upload/端云协同系统.docx
@@ -703,11 +703,78 @@
       </w:pPr>
       <w:r>
         <w:rPr>
-          <w:rFonts w:hint="eastAsia"/>
-          <w:color w:val="333333"/>
-          <w:sz w:val="22"/>
+          <w:rFonts w:hint="eastAsia" w:ascii="DengXian" w:hAnsi="DengXian"/>
+          <w:color w:val="333333"/>
+          <w:sz w:val="22"/>
+          <w:rFonts w:ascii="DengXian" w:eastAsia="DengXian" w:hAnsi="DengXian" w:hint="eastAsia"/>
         </w:rPr>
         <w:t>在此大背景下，本项目实现了一套“基于端云协同与多模态视觉大模型的 AIGC 图像显隐式标识评测系统”。系统创新性地采用端云协同（Client-Cloud Collaboration）的云边协作架构，并在云端引入先进的多模态视觉语言大模型（Llava 1.5），攻克了传统 OCR 难以识别艺术化、模糊化或倾斜角标的业界难点。通过这种端云协同架构，系统能够高时效、高置信度地得出商业生成图片的规范合规性报告，为媒体防伪和可信网络生态提供重要保障。</w:t>
+      </w:r>
+      <w:r>
+        <w:rPr>
+          <w:rFonts w:ascii="DengXian" w:hAnsi="DengXian"/>
+          <w:color w:val="333333"/>
+          <w:sz w:val="22"/>
+          <w:rFonts w:ascii="DengXian" w:eastAsia="DengXian" w:hAnsi="DengXian" w:hint="eastAsia"/>
+        </w:rPr>
+        <w:t xml:space="preserve"> （注：本项目已完成公网部署，用户可通过访问演示地址 </w:t>
+      </w:r>
+      <w:r>
+        <w:rPr>
+          <w:rFonts w:ascii="DengXian" w:hAnsi="DengXian"/>
+          <w:color w:val="333333"/>
+          <w:sz w:val="22"/>
+          <w:u w:val="single"/>
+          <w:rFonts w:ascii="DengXian" w:eastAsia="DengXian" w:hAnsi="DengXian" w:hint="eastAsia"/>
+        </w:rPr>
+        <w:t>https://aigc-eval.pages.dev/</w:t>
+      </w:r>
+      <w:r>
+        <w:rPr>
+          <w:rFonts w:ascii="DengXian" w:hAnsi="DengXian"/>
+          <w:color w:val="333333"/>
+          <w:sz w:val="22"/>
+          <w:rFonts w:ascii="DengXian" w:eastAsia="DengXian" w:hAnsi="DengXian" w:hint="eastAsia"/>
+        </w:rPr>
+        <w:t xml:space="preserve"> 或自定义域名 </w:t>
+      </w:r>
+      <w:r>
+        <w:rPr>
+          <w:rFonts w:ascii="DengXian" w:hAnsi="DengXian"/>
+          <w:color w:val="333333"/>
+          <w:sz w:val="22"/>
+          <w:u w:val="single"/>
+          <w:rFonts w:ascii="DengXian" w:eastAsia="DengXian" w:hAnsi="DengXian" w:hint="eastAsia"/>
+        </w:rPr>
+        <w:t>https://aigc.d3in.app/</w:t>
+      </w:r>
+      <w:r>
+        <w:rPr>
+          <w:rFonts w:ascii="DengXian" w:hAnsi="DengXian"/>
+          <w:color w:val="333333"/>
+          <w:sz w:val="22"/>
+          <w:rFonts w:ascii="DengXian" w:eastAsia="DengXian" w:hAnsi="DengXian" w:hint="eastAsia"/>
+        </w:rPr>
+        <w:t xml:space="preserve"> 访问系统进行在线评测与使用；本项目的完整前端、云端程序代码已在 GitHub 开源，开源托管地址为：</w:t>
+      </w:r>
+      <w:r>
+        <w:rPr>
+          <w:rFonts w:ascii="DengXian" w:hAnsi="DengXian"/>
+          <w:color w:val="333333"/>
+          <w:sz w:val="22"/>
+          <w:u w:val="single"/>
+          <w:rFonts w:ascii="DengXian" w:eastAsia="DengXian" w:hAnsi="DengXian" w:hint="eastAsia"/>
+        </w:rPr>
+        <w:t>https://github.com/d3intran/aigc-img-test</w:t>
+      </w:r>
+      <w:r>
+        <w:rPr>
+          <w:rFonts w:ascii="DengXian" w:hAnsi="DengXian"/>
+          <w:color w:val="333333"/>
+          <w:sz w:val="22"/>
+          <w:rFonts w:ascii="DengXian" w:eastAsia="DengXian" w:hAnsi="DengXian" w:hint="eastAsia"/>
+        </w:rPr>
+        <w:t>，供公开审计与交流学习。）</w:t>
       </w:r>
     </w:p>
     <w:p>

</xml_diff>